<commit_message>
update initial documentation adding images
</commit_message>
<xml_diff>
--- a/FinalDocumentation.docx
+++ b/FinalDocumentation.docx
@@ -613,12 +613,64 @@
       </w:r>
     </w:p>
     <w:p>
+      <w:pPr>
+        <w:spacing w:after="120" w:before="120"/>
+        <w:jc w:val="center"/>
+      </w:pPr>
+      <w:r>
+        <w:drawing>
+          <wp:inline distT="0" distB="0" distL="0" distR="0">
+            <wp:extent cx="2219325" cy="7620000"/>
+            <wp:effectExtent t="0" r="0" b="0" l="0"/>
+            <wp:docPr id="1" name="usecase.png" descr="Use Case Diagram" title="Use Case Diagram"/>
+            <wp:cNvGraphicFramePr>
+              <a:graphicFrameLocks xmlns:a="http://schemas.openxmlformats.org/drawingml/2006/main" noChangeAspect="1"/>
+            </wp:cNvGraphicFramePr>
+            <a:graphic xmlns:a="http://schemas.openxmlformats.org/drawingml/2006/main">
+              <a:graphicData uri="http://schemas.openxmlformats.org/drawingml/2006/picture">
+                <pic:pic xmlns:pic="http://schemas.openxmlformats.org/drawingml/2006/picture">
+                  <pic:nvPicPr>
+                    <pic:cNvPr id="0" name="" descr=""/>
+                    <pic:cNvPicPr>
+                      <a:picLocks noChangeAspect="1" noChangeArrowheads="1"/>
+                    </pic:cNvPicPr>
+                  </pic:nvPicPr>
+                  <pic:blipFill>
+                    <a:blip r:embed="rId8" cstate="none"/>
+                    <a:srcRect/>
+                    <a:stretch>
+                      <a:fillRect/>
+                    </a:stretch>
+                  </pic:blipFill>
+                  <pic:spPr bwMode="auto">
+                    <a:xfrm>
+                      <a:off x="0" y="0"/>
+                      <a:ext cx="2219325" cy="7620000"/>
+                    </a:xfrm>
+                    <a:prstGeom prst="rect">
+                      <a:avLst/>
+                    </a:prstGeom>
+                  </pic:spPr>
+                </pic:pic>
+              </a:graphicData>
+            </a:graphic>
+          </wp:inline>
+        </w:drawing>
+      </w:r>
+    </w:p>
+    <w:p>
+      <w:pPr>
+        <w:spacing w:after="200"/>
+        <w:jc w:val="center"/>
+      </w:pPr>
       <w:r>
         <w:rPr>
           <w:i/>
           <w:iCs/>
+          <w:sz w:val="20"/>
+          <w:szCs w:val="20"/>
         </w:rPr>
-        <w:t xml:space="preserve">[Insert: Documentation/User-Cases/Use-Case-Diagram1.jpg]</w:t>
+        <w:t xml:space="preserve">Figure 1: Use Case Diagram</w:t>
       </w:r>
     </w:p>
     <w:p>
@@ -4022,12 +4074,64 @@
       </w:r>
     </w:p>
     <w:p>
+      <w:pPr>
+        <w:spacing w:after="120" w:before="120"/>
+        <w:jc w:val="center"/>
+      </w:pPr>
+      <w:r>
+        <w:drawing>
+          <wp:inline distT="0" distB="0" distL="0" distR="0">
+            <wp:extent cx="5715000" cy="5972175"/>
+            <wp:effectExtent t="0" r="0" b="0" l="0"/>
+            <wp:docPr id="1" name="domain.png" descr="Domain Model" title="Domain Model"/>
+            <wp:cNvGraphicFramePr>
+              <a:graphicFrameLocks xmlns:a="http://schemas.openxmlformats.org/drawingml/2006/main" noChangeAspect="1"/>
+            </wp:cNvGraphicFramePr>
+            <a:graphic xmlns:a="http://schemas.openxmlformats.org/drawingml/2006/main">
+              <a:graphicData uri="http://schemas.openxmlformats.org/drawingml/2006/picture">
+                <pic:pic xmlns:pic="http://schemas.openxmlformats.org/drawingml/2006/picture">
+                  <pic:nvPicPr>
+                    <pic:cNvPr id="0" name="" descr=""/>
+                    <pic:cNvPicPr>
+                      <a:picLocks noChangeAspect="1" noChangeArrowheads="1"/>
+                    </pic:cNvPicPr>
+                  </pic:nvPicPr>
+                  <pic:blipFill>
+                    <a:blip r:embed="rId9" cstate="none"/>
+                    <a:srcRect/>
+                    <a:stretch>
+                      <a:fillRect/>
+                    </a:stretch>
+                  </pic:blipFill>
+                  <pic:spPr bwMode="auto">
+                    <a:xfrm>
+                      <a:off x="0" y="0"/>
+                      <a:ext cx="5715000" cy="5972175"/>
+                    </a:xfrm>
+                    <a:prstGeom prst="rect">
+                      <a:avLst/>
+                    </a:prstGeom>
+                  </pic:spPr>
+                </pic:pic>
+              </a:graphicData>
+            </a:graphic>
+          </wp:inline>
+        </w:drawing>
+      </w:r>
+    </w:p>
+    <w:p>
+      <w:pPr>
+        <w:spacing w:after="200"/>
+        <w:jc w:val="center"/>
+      </w:pPr>
       <w:r>
         <w:rPr>
           <w:i/>
           <w:iCs/>
+          <w:sz w:val="20"/>
+          <w:szCs w:val="20"/>
         </w:rPr>
-        <w:t xml:space="preserve">[Insert: rendered DomainModel.md class diagram — see Documentation/DomainModel.md]</w:t>
+        <w:t xml:space="preserve">Figure 2: Domain Model</w:t>
       </w:r>
     </w:p>
     <w:p>
@@ -4040,48 +4144,214 @@
     </w:p>
     <w:p>
       <w:r>
-        <w:t xml:space="preserve">System Sequence Diagrams for the three guest-facing fully-dressed use cases:</w:t>
-      </w:r>
-    </w:p>
-    <w:p>
-      <w:pPr>
-        <w:pStyle w:val="ListParagraph"/>
-        <w:numPr>
-          <w:ilvl w:val="0"/>
-          <w:numId w:val="2"/>
-        </w:numPr>
-      </w:pPr>
-      <w:r>
-        <w:t xml:space="preserve">Make Reservation: Guest → searchAvailableRooms → availableRooms; Guest → makeReservation → reservationConfirmation.</w:t>
-      </w:r>
-    </w:p>
-    <w:p>
-      <w:pPr>
-        <w:pStyle w:val="ListParagraph"/>
-        <w:numPr>
-          <w:ilvl w:val="0"/>
-          <w:numId w:val="2"/>
-        </w:numPr>
-      </w:pPr>
-      <w:r>
-        <w:t xml:space="preserve">Cancel Reservation: Guest → getReservations → reservationList; Guest → cancelReservation → cancellationConfirmation.</w:t>
-      </w:r>
-    </w:p>
-    <w:p>
-      <w:pPr>
-        <w:pStyle w:val="ListParagraph"/>
-        <w:numPr>
-          <w:ilvl w:val="0"/>
-          <w:numId w:val="2"/>
-        </w:numPr>
-      </w:pPr>
-      <w:r>
-        <w:t xml:space="preserve">Search Available Room: Guest → searchAvailableRooms → availableRoomList.</w:t>
-      </w:r>
-    </w:p>
-    <w:p>
-      <w:r>
-        <w:t xml:space="preserve">Diagrams are rendered from Mermaid sources in each use case file under Documentation/User-Cases/ and exported to PDF for inclusion.</w:t>
+        <w:t xml:space="preserve">System Sequence Diagrams for the three guest-facing fully-dressed use cases. Each shows the actor and the system as a black box; only system events initiated by the actor are included.</w:t>
+      </w:r>
+    </w:p>
+    <w:p>
+      <w:pPr>
+        <w:pStyle w:val="Heading3"/>
+      </w:pPr>
+      <w:r>
+        <w:t xml:space="preserve">6.1 SSD — Make Reservation</w:t>
+      </w:r>
+    </w:p>
+    <w:p>
+      <w:pPr>
+        <w:spacing w:after="120" w:before="120"/>
+        <w:jc w:val="center"/>
+      </w:pPr>
+      <w:r>
+        <w:drawing>
+          <wp:inline distT="0" distB="0" distL="0" distR="0">
+            <wp:extent cx="5715000" cy="2228850"/>
+            <wp:effectExtent t="0" r="0" b="0" l="0"/>
+            <wp:docPr id="1" name="ssd_makeres.png" descr="ssd_makeres.png" title="ssd_makeres.png"/>
+            <wp:cNvGraphicFramePr>
+              <a:graphicFrameLocks xmlns:a="http://schemas.openxmlformats.org/drawingml/2006/main" noChangeAspect="1"/>
+            </wp:cNvGraphicFramePr>
+            <a:graphic xmlns:a="http://schemas.openxmlformats.org/drawingml/2006/main">
+              <a:graphicData uri="http://schemas.openxmlformats.org/drawingml/2006/picture">
+                <pic:pic xmlns:pic="http://schemas.openxmlformats.org/drawingml/2006/picture">
+                  <pic:nvPicPr>
+                    <pic:cNvPr id="0" name="" descr=""/>
+                    <pic:cNvPicPr>
+                      <a:picLocks noChangeAspect="1" noChangeArrowheads="1"/>
+                    </pic:cNvPicPr>
+                  </pic:nvPicPr>
+                  <pic:blipFill>
+                    <a:blip r:embed="rId10" cstate="none"/>
+                    <a:srcRect/>
+                    <a:stretch>
+                      <a:fillRect/>
+                    </a:stretch>
+                  </pic:blipFill>
+                  <pic:spPr bwMode="auto">
+                    <a:xfrm>
+                      <a:off x="0" y="0"/>
+                      <a:ext cx="5715000" cy="2228850"/>
+                    </a:xfrm>
+                    <a:prstGeom prst="rect">
+                      <a:avLst/>
+                    </a:prstGeom>
+                  </pic:spPr>
+                </pic:pic>
+              </a:graphicData>
+            </a:graphic>
+          </wp:inline>
+        </w:drawing>
+      </w:r>
+    </w:p>
+    <w:p>
+      <w:pPr>
+        <w:spacing w:after="200"/>
+        <w:jc w:val="center"/>
+      </w:pPr>
+      <w:r>
+        <w:rPr>
+          <w:i/>
+          <w:iCs/>
+          <w:sz w:val="20"/>
+          <w:szCs w:val="20"/>
+        </w:rPr>
+        <w:t xml:space="preserve">Figure 3: SSD — Make Reservation</w:t>
+      </w:r>
+    </w:p>
+    <w:p>
+      <w:pPr>
+        <w:pStyle w:val="Heading3"/>
+      </w:pPr>
+      <w:r>
+        <w:t xml:space="preserve">6.2 SSD — Cancel Reservation</w:t>
+      </w:r>
+    </w:p>
+    <w:p>
+      <w:pPr>
+        <w:spacing w:after="120" w:before="120"/>
+        <w:jc w:val="center"/>
+      </w:pPr>
+      <w:r>
+        <w:drawing>
+          <wp:inline distT="0" distB="0" distL="0" distR="0">
+            <wp:extent cx="4762500" cy="3143250"/>
+            <wp:effectExtent t="0" r="0" b="0" l="0"/>
+            <wp:docPr id="1" name="ssd_cancel.png" descr="ssd_cancel.png" title="ssd_cancel.png"/>
+            <wp:cNvGraphicFramePr>
+              <a:graphicFrameLocks xmlns:a="http://schemas.openxmlformats.org/drawingml/2006/main" noChangeAspect="1"/>
+            </wp:cNvGraphicFramePr>
+            <a:graphic xmlns:a="http://schemas.openxmlformats.org/drawingml/2006/main">
+              <a:graphicData uri="http://schemas.openxmlformats.org/drawingml/2006/picture">
+                <pic:pic xmlns:pic="http://schemas.openxmlformats.org/drawingml/2006/picture">
+                  <pic:nvPicPr>
+                    <pic:cNvPr id="0" name="" descr=""/>
+                    <pic:cNvPicPr>
+                      <a:picLocks noChangeAspect="1" noChangeArrowheads="1"/>
+                    </pic:cNvPicPr>
+                  </pic:nvPicPr>
+                  <pic:blipFill>
+                    <a:blip r:embed="rId11" cstate="none"/>
+                    <a:srcRect/>
+                    <a:stretch>
+                      <a:fillRect/>
+                    </a:stretch>
+                  </pic:blipFill>
+                  <pic:spPr bwMode="auto">
+                    <a:xfrm>
+                      <a:off x="0" y="0"/>
+                      <a:ext cx="4762500" cy="3143250"/>
+                    </a:xfrm>
+                    <a:prstGeom prst="rect">
+                      <a:avLst/>
+                    </a:prstGeom>
+                  </pic:spPr>
+                </pic:pic>
+              </a:graphicData>
+            </a:graphic>
+          </wp:inline>
+        </w:drawing>
+      </w:r>
+    </w:p>
+    <w:p>
+      <w:pPr>
+        <w:spacing w:after="200"/>
+        <w:jc w:val="center"/>
+      </w:pPr>
+      <w:r>
+        <w:rPr>
+          <w:i/>
+          <w:iCs/>
+          <w:sz w:val="20"/>
+          <w:szCs w:val="20"/>
+        </w:rPr>
+        <w:t xml:space="preserve">Figure 4: SSD — Cancel Reservation</w:t>
+      </w:r>
+    </w:p>
+    <w:p>
+      <w:pPr>
+        <w:pStyle w:val="Heading3"/>
+      </w:pPr>
+      <w:r>
+        <w:t xml:space="preserve">6.3 SSD — Search Available Room</w:t>
+      </w:r>
+    </w:p>
+    <w:p>
+      <w:pPr>
+        <w:spacing w:after="120" w:before="120"/>
+        <w:jc w:val="center"/>
+      </w:pPr>
+      <w:r>
+        <w:drawing>
+          <wp:inline distT="0" distB="0" distL="0" distR="0">
+            <wp:extent cx="5715000" cy="1724025"/>
+            <wp:effectExtent t="0" r="0" b="0" l="0"/>
+            <wp:docPr id="1" name="ssd_search.png" descr="ssd_search.png" title="ssd_search.png"/>
+            <wp:cNvGraphicFramePr>
+              <a:graphicFrameLocks xmlns:a="http://schemas.openxmlformats.org/drawingml/2006/main" noChangeAspect="1"/>
+            </wp:cNvGraphicFramePr>
+            <a:graphic xmlns:a="http://schemas.openxmlformats.org/drawingml/2006/main">
+              <a:graphicData uri="http://schemas.openxmlformats.org/drawingml/2006/picture">
+                <pic:pic xmlns:pic="http://schemas.openxmlformats.org/drawingml/2006/picture">
+                  <pic:nvPicPr>
+                    <pic:cNvPr id="0" name="" descr=""/>
+                    <pic:cNvPicPr>
+                      <a:picLocks noChangeAspect="1" noChangeArrowheads="1"/>
+                    </pic:cNvPicPr>
+                  </pic:nvPicPr>
+                  <pic:blipFill>
+                    <a:blip r:embed="rId12" cstate="none"/>
+                    <a:srcRect/>
+                    <a:stretch>
+                      <a:fillRect/>
+                    </a:stretch>
+                  </pic:blipFill>
+                  <pic:spPr bwMode="auto">
+                    <a:xfrm>
+                      <a:off x="0" y="0"/>
+                      <a:ext cx="5715000" cy="1724025"/>
+                    </a:xfrm>
+                    <a:prstGeom prst="rect">
+                      <a:avLst/>
+                    </a:prstGeom>
+                  </pic:spPr>
+                </pic:pic>
+              </a:graphicData>
+            </a:graphic>
+          </wp:inline>
+        </w:drawing>
+      </w:r>
+    </w:p>
+    <w:p>
+      <w:pPr>
+        <w:spacing w:after="200"/>
+        <w:jc w:val="center"/>
+      </w:pPr>
+      <w:r>
+        <w:rPr>
+          <w:i/>
+          <w:iCs/>
+          <w:sz w:val="20"/>
+          <w:szCs w:val="20"/>
+        </w:rPr>
+        <w:t xml:space="preserve">Figure 5: SSD — Search Available Room</w:t>
       </w:r>
     </w:p>
     <w:p>
@@ -6008,7 +6278,214 @@
     </w:p>
     <w:p>
       <w:r>
-        <w:t xml:space="preserve">Design-level sequence diagrams for the fully-dressed use cases follow GRASP responsibility assignment: a use-case Controller per use case (e.g., MakeReservationHandler, CancelReservationHandler, CheckOutHandler), Information Expert assignment to the domain classes that own the data (Room knows its rates; Reservation calculates its own totalCost and final bill), Pure Fabrication catalog classes (RoomCatalog, GuestCatalog, ReservationCatalog, PurchaseCatalog) for persistence and lookups, and the Creator pattern applied to Guest creating Reservation per the domain association "Guest 1—* Reservation : makes". Full Mermaid sources for each sequence diagram are in the corresponding use case file under Documentation/User-Cases/.</w:t>
+        <w:t xml:space="preserve">Design-level sequence diagrams for the same three fully-dressed use cases. They follow GRASP responsibility assignment: a use-case Controller per use case (e.g., MakeReservationHandler, CancelReservationHandler, SearchRoomHandler), Information Expert assignment to the domain classes that own the data (Room knows its rates; Reservation calculates its own totalCost and final bill), Pure Fabrication catalog classes (RoomCatalog, GuestCatalog, ReservationCatalog, AuditLog) for persistence and lookups, and the Creator pattern applied to Guest creating Reservation per the domain association "Guest 1—* Reservation : makes".</w:t>
+      </w:r>
+    </w:p>
+    <w:p>
+      <w:pPr>
+        <w:pStyle w:val="Heading3"/>
+      </w:pPr>
+      <w:r>
+        <w:t xml:space="preserve">8.1 Design Sequence — Make Reservation</w:t>
+      </w:r>
+    </w:p>
+    <w:p>
+      <w:pPr>
+        <w:spacing w:after="120" w:before="120"/>
+        <w:jc w:val="center"/>
+      </w:pPr>
+      <w:r>
+        <w:drawing>
+          <wp:inline distT="0" distB="0" distL="0" distR="0">
+            <wp:extent cx="5715000" cy="2876550"/>
+            <wp:effectExtent t="0" r="0" b="0" l="0"/>
+            <wp:docPr id="1" name="design_makeres.png" descr="design_makeres.png" title="design_makeres.png"/>
+            <wp:cNvGraphicFramePr>
+              <a:graphicFrameLocks xmlns:a="http://schemas.openxmlformats.org/drawingml/2006/main" noChangeAspect="1"/>
+            </wp:cNvGraphicFramePr>
+            <a:graphic xmlns:a="http://schemas.openxmlformats.org/drawingml/2006/main">
+              <a:graphicData uri="http://schemas.openxmlformats.org/drawingml/2006/picture">
+                <pic:pic xmlns:pic="http://schemas.openxmlformats.org/drawingml/2006/picture">
+                  <pic:nvPicPr>
+                    <pic:cNvPr id="0" name="" descr=""/>
+                    <pic:cNvPicPr>
+                      <a:picLocks noChangeAspect="1" noChangeArrowheads="1"/>
+                    </pic:cNvPicPr>
+                  </pic:nvPicPr>
+                  <pic:blipFill>
+                    <a:blip r:embed="rId13" cstate="none"/>
+                    <a:srcRect/>
+                    <a:stretch>
+                      <a:fillRect/>
+                    </a:stretch>
+                  </pic:blipFill>
+                  <pic:spPr bwMode="auto">
+                    <a:xfrm>
+                      <a:off x="0" y="0"/>
+                      <a:ext cx="5715000" cy="2876550"/>
+                    </a:xfrm>
+                    <a:prstGeom prst="rect">
+                      <a:avLst/>
+                    </a:prstGeom>
+                  </pic:spPr>
+                </pic:pic>
+              </a:graphicData>
+            </a:graphic>
+          </wp:inline>
+        </w:drawing>
+      </w:r>
+    </w:p>
+    <w:p>
+      <w:pPr>
+        <w:spacing w:after="200"/>
+        <w:jc w:val="center"/>
+      </w:pPr>
+      <w:r>
+        <w:rPr>
+          <w:i/>
+          <w:iCs/>
+          <w:sz w:val="20"/>
+          <w:szCs w:val="20"/>
+        </w:rPr>
+        <w:t xml:space="preserve">Figure 6: Design Sequence Diagram — Make Reservation</w:t>
+      </w:r>
+    </w:p>
+    <w:p>
+      <w:pPr>
+        <w:pStyle w:val="Heading3"/>
+      </w:pPr>
+      <w:r>
+        <w:t xml:space="preserve">8.2 Design Sequence — Cancel Reservation</w:t>
+      </w:r>
+    </w:p>
+    <w:p>
+      <w:pPr>
+        <w:spacing w:after="120" w:before="120"/>
+        <w:jc w:val="center"/>
+      </w:pPr>
+      <w:r>
+        <w:drawing>
+          <wp:inline distT="0" distB="0" distL="0" distR="0">
+            <wp:extent cx="5715000" cy="5695950"/>
+            <wp:effectExtent t="0" r="0" b="0" l="0"/>
+            <wp:docPr id="1" name="design_cancel.png" descr="design_cancel.png" title="design_cancel.png"/>
+            <wp:cNvGraphicFramePr>
+              <a:graphicFrameLocks xmlns:a="http://schemas.openxmlformats.org/drawingml/2006/main" noChangeAspect="1"/>
+            </wp:cNvGraphicFramePr>
+            <a:graphic xmlns:a="http://schemas.openxmlformats.org/drawingml/2006/main">
+              <a:graphicData uri="http://schemas.openxmlformats.org/drawingml/2006/picture">
+                <pic:pic xmlns:pic="http://schemas.openxmlformats.org/drawingml/2006/picture">
+                  <pic:nvPicPr>
+                    <pic:cNvPr id="0" name="" descr=""/>
+                    <pic:cNvPicPr>
+                      <a:picLocks noChangeAspect="1" noChangeArrowheads="1"/>
+                    </pic:cNvPicPr>
+                  </pic:nvPicPr>
+                  <pic:blipFill>
+                    <a:blip r:embed="rId14" cstate="none"/>
+                    <a:srcRect/>
+                    <a:stretch>
+                      <a:fillRect/>
+                    </a:stretch>
+                  </pic:blipFill>
+                  <pic:spPr bwMode="auto">
+                    <a:xfrm>
+                      <a:off x="0" y="0"/>
+                      <a:ext cx="5715000" cy="5695950"/>
+                    </a:xfrm>
+                    <a:prstGeom prst="rect">
+                      <a:avLst/>
+                    </a:prstGeom>
+                  </pic:spPr>
+                </pic:pic>
+              </a:graphicData>
+            </a:graphic>
+          </wp:inline>
+        </w:drawing>
+      </w:r>
+    </w:p>
+    <w:p>
+      <w:pPr>
+        <w:spacing w:after="200"/>
+        <w:jc w:val="center"/>
+      </w:pPr>
+      <w:r>
+        <w:rPr>
+          <w:i/>
+          <w:iCs/>
+          <w:sz w:val="20"/>
+          <w:szCs w:val="20"/>
+        </w:rPr>
+        <w:t xml:space="preserve">Figure 7: Design Sequence Diagram — Cancel Reservation</w:t>
+      </w:r>
+    </w:p>
+    <w:p>
+      <w:pPr>
+        <w:pStyle w:val="Heading3"/>
+      </w:pPr>
+      <w:r>
+        <w:t xml:space="preserve">8.3 Design Sequence — Search Available Room</w:t>
+      </w:r>
+    </w:p>
+    <w:p>
+      <w:pPr>
+        <w:spacing w:after="120" w:before="120"/>
+        <w:jc w:val="center"/>
+      </w:pPr>
+      <w:r>
+        <w:drawing>
+          <wp:inline distT="0" distB="0" distL="0" distR="0">
+            <wp:extent cx="5715000" cy="1638300"/>
+            <wp:effectExtent t="0" r="0" b="0" l="0"/>
+            <wp:docPr id="1" name="design_search.png" descr="design_search.png" title="design_search.png"/>
+            <wp:cNvGraphicFramePr>
+              <a:graphicFrameLocks xmlns:a="http://schemas.openxmlformats.org/drawingml/2006/main" noChangeAspect="1"/>
+            </wp:cNvGraphicFramePr>
+            <a:graphic xmlns:a="http://schemas.openxmlformats.org/drawingml/2006/main">
+              <a:graphicData uri="http://schemas.openxmlformats.org/drawingml/2006/picture">
+                <pic:pic xmlns:pic="http://schemas.openxmlformats.org/drawingml/2006/picture">
+                  <pic:nvPicPr>
+                    <pic:cNvPr id="0" name="" descr=""/>
+                    <pic:cNvPicPr>
+                      <a:picLocks noChangeAspect="1" noChangeArrowheads="1"/>
+                    </pic:cNvPicPr>
+                  </pic:nvPicPr>
+                  <pic:blipFill>
+                    <a:blip r:embed="rId15" cstate="none"/>
+                    <a:srcRect/>
+                    <a:stretch>
+                      <a:fillRect/>
+                    </a:stretch>
+                  </pic:blipFill>
+                  <pic:spPr bwMode="auto">
+                    <a:xfrm>
+                      <a:off x="0" y="0"/>
+                      <a:ext cx="5715000" cy="1638300"/>
+                    </a:xfrm>
+                    <a:prstGeom prst="rect">
+                      <a:avLst/>
+                    </a:prstGeom>
+                  </pic:spPr>
+                </pic:pic>
+              </a:graphicData>
+            </a:graphic>
+          </wp:inline>
+        </w:drawing>
+      </w:r>
+    </w:p>
+    <w:p>
+      <w:pPr>
+        <w:spacing w:after="200"/>
+        <w:jc w:val="center"/>
+      </w:pPr>
+      <w:r>
+        <w:rPr>
+          <w:i/>
+          <w:iCs/>
+          <w:sz w:val="20"/>
+          <w:szCs w:val="20"/>
+        </w:rPr>
+        <w:t xml:space="preserve">Figure 8: Design Sequence Diagram — Search Available Room</w:t>
       </w:r>
     </w:p>
     <w:p>
@@ -6082,6 +6559,133 @@
       </w:pPr>
       <w:r>
         <w:t xml:space="preserve">Three enumerations (UserRole, RoomStatus, ReservationStatus) bound the state machines for authorization, room status, and reservation lifecycle.</w:t>
+      </w:r>
+    </w:p>
+    <w:p>
+      <w:pPr>
+        <w:spacing w:after="120" w:before="120"/>
+        <w:jc w:val="center"/>
+      </w:pPr>
+      <w:r>
+        <w:drawing>
+          <wp:inline distT="0" distB="0" distL="0" distR="0">
+            <wp:extent cx="6191250" cy="1847850"/>
+            <wp:effectExtent t="0" r="0" b="0" l="0"/>
+            <wp:docPr id="1" name="dcd.png" descr="dcd.png" title="dcd.png"/>
+            <wp:cNvGraphicFramePr>
+              <a:graphicFrameLocks xmlns:a="http://schemas.openxmlformats.org/drawingml/2006/main" noChangeAspect="1"/>
+            </wp:cNvGraphicFramePr>
+            <a:graphic xmlns:a="http://schemas.openxmlformats.org/drawingml/2006/main">
+              <a:graphicData uri="http://schemas.openxmlformats.org/drawingml/2006/picture">
+                <pic:pic xmlns:pic="http://schemas.openxmlformats.org/drawingml/2006/picture">
+                  <pic:nvPicPr>
+                    <pic:cNvPr id="0" name="" descr=""/>
+                    <pic:cNvPicPr>
+                      <a:picLocks noChangeAspect="1" noChangeArrowheads="1"/>
+                    </pic:cNvPicPr>
+                  </pic:nvPicPr>
+                  <pic:blipFill>
+                    <a:blip r:embed="rId16" cstate="none"/>
+                    <a:srcRect/>
+                    <a:stretch>
+                      <a:fillRect/>
+                    </a:stretch>
+                  </pic:blipFill>
+                  <pic:spPr bwMode="auto">
+                    <a:xfrm>
+                      <a:off x="0" y="0"/>
+                      <a:ext cx="6191250" cy="1847850"/>
+                    </a:xfrm>
+                    <a:prstGeom prst="rect">
+                      <a:avLst/>
+                    </a:prstGeom>
+                  </pic:spPr>
+                </pic:pic>
+              </a:graphicData>
+            </a:graphic>
+          </wp:inline>
+        </w:drawing>
+      </w:r>
+    </w:p>
+    <w:p>
+      <w:pPr>
+        <w:spacing w:after="200"/>
+        <w:jc w:val="center"/>
+      </w:pPr>
+      <w:r>
+        <w:rPr>
+          <w:i/>
+          <w:iCs/>
+          <w:sz w:val="20"/>
+          <w:szCs w:val="20"/>
+        </w:rPr>
+        <w:t xml:space="preserve">Figure 9: Design Class Diagram</w:t>
+      </w:r>
+    </w:p>
+    <w:p>
+      <w:r>
+        <w:t xml:space="preserve">The package/layer view below shows how the implementation packages map onto the four-layer architecture:</w:t>
+      </w:r>
+    </w:p>
+    <w:p>
+      <w:pPr>
+        <w:spacing w:after="120" w:before="120"/>
+        <w:jc w:val="center"/>
+      </w:pPr>
+      <w:r>
+        <w:drawing>
+          <wp:inline distT="0" distB="0" distL="0" distR="0">
+            <wp:extent cx="5715000" cy="3686175"/>
+            <wp:effectExtent t="0" r="0" b="0" l="0"/>
+            <wp:docPr id="1" name="package.png" descr="package.png" title="package.png"/>
+            <wp:cNvGraphicFramePr>
+              <a:graphicFrameLocks xmlns:a="http://schemas.openxmlformats.org/drawingml/2006/main" noChangeAspect="1"/>
+            </wp:cNvGraphicFramePr>
+            <a:graphic xmlns:a="http://schemas.openxmlformats.org/drawingml/2006/main">
+              <a:graphicData uri="http://schemas.openxmlformats.org/drawingml/2006/picture">
+                <pic:pic xmlns:pic="http://schemas.openxmlformats.org/drawingml/2006/picture">
+                  <pic:nvPicPr>
+                    <pic:cNvPr id="0" name="" descr=""/>
+                    <pic:cNvPicPr>
+                      <a:picLocks noChangeAspect="1" noChangeArrowheads="1"/>
+                    </pic:cNvPicPr>
+                  </pic:nvPicPr>
+                  <pic:blipFill>
+                    <a:blip r:embed="rId17" cstate="none"/>
+                    <a:srcRect/>
+                    <a:stretch>
+                      <a:fillRect/>
+                    </a:stretch>
+                  </pic:blipFill>
+                  <pic:spPr bwMode="auto">
+                    <a:xfrm>
+                      <a:off x="0" y="0"/>
+                      <a:ext cx="5715000" cy="3686175"/>
+                    </a:xfrm>
+                    <a:prstGeom prst="rect">
+                      <a:avLst/>
+                    </a:prstGeom>
+                  </pic:spPr>
+                </pic:pic>
+              </a:graphicData>
+            </a:graphic>
+          </wp:inline>
+        </w:drawing>
+      </w:r>
+    </w:p>
+    <w:p>
+      <w:pPr>
+        <w:spacing w:after="200"/>
+        <w:jc w:val="center"/>
+      </w:pPr>
+      <w:r>
+        <w:rPr>
+          <w:i/>
+          <w:iCs/>
+          <w:sz w:val="20"/>
+          <w:szCs w:val="20"/>
+        </w:rPr>
+        <w:t xml:space="preserve">Figure 10: Package / Layer Diagram</w:t>
       </w:r>
     </w:p>
     <w:p>

</xml_diff>